<commit_message>
refactor(templates,sidang): update template formatting and adjust KPPS notification visibility condition
</commit_message>
<xml_diff>
--- a/template/undangan seminar kemajuan TEMPLATE.docx
+++ b/template/undangan seminar kemajuan TEMPLATE.docx
@@ -1,7 +1,80 @@
 
 <file path=word/document.xml><?xml version="1.0" encoding="utf-8"?>
-<w:document xmlns:wpc="http://schemas.microsoft.com/office/word/2010/wordprocessingCanvas" xmlns:cx="http://schemas.microsoft.com/office/drawing/2014/chartex" xmlns:cx1="http://schemas.microsoft.com/office/drawing/2015/9/8/chartex" xmlns:cx2="http://schemas.microsoft.com/office/drawing/2015/10/21/chartex" xmlns:cx3="http://schemas.microsoft.com/office/drawing/2016/5/9/chartex" xmlns:cx4="http://schemas.microsoft.com/office/drawing/2016/5/10/chartex" xmlns:cx5="http://schemas.microsoft.com/office/drawing/2016/5/11/chartex" xmlns:cx6="http://schemas.microsoft.com/office/drawing/2016/5/12/chartex" xmlns:cx7="http://schemas.microsoft.com/office/drawing/2016/5/13/chartex" xmlns:cx8="http://schemas.microsoft.com/office/drawing/2016/5/14/chartex" xmlns:mc="http://schemas.openxmlformats.org/markup-compatibility/2006" xmlns:aink="http://schemas.microsoft.com/office/drawing/2016/ink" xmlns:am3d="http://schemas.microsoft.com/office/drawing/2017/model3d" xmlns:o="urn:schemas-microsoft-com:office:office" xmlns:oel="http://schemas.microsoft.com/office/2019/extlst" xmlns:r="http://schemas.openxmlformats.org/officeDocument/2006/relationships" xmlns:m="http://schemas.openxmlformats.org/officeDocument/2006/math" xmlns:v="urn:schemas-microsoft-com:vml" xmlns:wp14="http://schemas.microsoft.com/office/word/2010/wordprocessingDrawing" xmlns:wp="http://schemas.openxmlformats.org/drawingml/2006/wordprocessingDrawing" xmlns:w10="urn:schemas-microsoft-com:office:word" xmlns:w="http://schemas.openxmlformats.org/wordprocessingml/2006/main" xmlns:w14="http://schemas.microsoft.com/office/word/2010/wordml" xmlns:w15="http://schemas.microsoft.com/office/word/2012/wordml" xmlns:w16cex="http://schemas.microsoft.com/office/word/2018/wordml/cex" xmlns:w16cid="http://schemas.microsoft.com/office/word/2016/wordml/cid" xmlns:w16="http://schemas.microsoft.com/office/word/2018/wordml" xmlns:w16du="http://schemas.microsoft.com/office/word/2023/wordml/word16du" xmlns:w16sdtdh="http://schemas.microsoft.com/office/word/2020/wordml/sdtdatahash" xmlns:w16sdtfl="http://schemas.microsoft.com/office/word/2024/wordml/sdtformatlock" xmlns:w16se="http://schemas.microsoft.com/office/word/2015/wordml/symex" xmlns:wpg="http://schemas.microsoft.com/office/word/2010/wordprocessingGroup" xmlns:wpi="http://schemas.microsoft.com/office/word/2010/wordprocessingInk" xmlns:wne="http://schemas.microsoft.com/office/word/2006/wordml" xmlns:wps="http://schemas.microsoft.com/office/word/2010/wordprocessingShape" mc:Ignorable="w14 w15 w16se w16cid w16 w16cex w16sdtdh w16sdtfl w16du wp14">
+<w:document xmlns:wpc="http://schemas.microsoft.com/office/word/2010/wordprocessingCanvas" xmlns:cx="http://schemas.microsoft.com/office/drawing/2014/chartex" xmlns:mc="http://schemas.openxmlformats.org/markup-compatibility/2006" xmlns:o="urn:schemas-microsoft-com:office:office" xmlns:r="http://schemas.openxmlformats.org/officeDocument/2006/relationships" xmlns:m="http://schemas.openxmlformats.org/officeDocument/2006/math" xmlns:v="urn:schemas-microsoft-com:vml" xmlns:wp14="http://schemas.microsoft.com/office/word/2010/wordprocessingDrawing" xmlns:wp="http://schemas.openxmlformats.org/drawingml/2006/wordprocessingDrawing" xmlns:w10="urn:schemas-microsoft-com:office:word" xmlns:w="http://schemas.openxmlformats.org/wordprocessingml/2006/main" xmlns:w14="http://schemas.microsoft.com/office/word/2010/wordml" xmlns:w15="http://schemas.microsoft.com/office/word/2012/wordml" xmlns:w16se="http://schemas.microsoft.com/office/word/2015/wordml/symex" xmlns:wpg="http://schemas.microsoft.com/office/word/2010/wordprocessingGroup" xmlns:wpi="http://schemas.microsoft.com/office/word/2010/wordprocessingInk" xmlns:wne="http://schemas.microsoft.com/office/word/2006/wordml" xmlns:wps="http://schemas.microsoft.com/office/word/2010/wordprocessingShape" mc:Ignorable="w14 w15 w16se wp14">
   <w:body>
+    <w:tbl>
+      <w:tblPr>
+        <w:tblStyle w:val="TableGrid"/>
+        <w:tblW w:w="0" w:type="auto"/>
+        <w:tblInd w:w="142" w:type="dxa"/>
+        <w:tblBorders>
+          <w:top w:val="none" w:sz="0" w:space="0" w:color="auto"/>
+          <w:left w:val="none" w:sz="0" w:space="0" w:color="auto"/>
+          <w:bottom w:val="none" w:sz="0" w:space="0" w:color="auto"/>
+          <w:right w:val="none" w:sz="0" w:space="0" w:color="auto"/>
+          <w:insideH w:val="none" w:sz="0" w:space="0" w:color="auto"/>
+          <w:insideV w:val="none" w:sz="0" w:space="0" w:color="auto"/>
+        </w:tblBorders>
+        <w:tblLook w:val="04A0" w:firstRow="1" w:lastRow="0" w:firstColumn="1" w:lastColumn="0" w:noHBand="0" w:noVBand="1"/>
+      </w:tblPr>
+      <w:tblGrid>
+        <w:gridCol w:w="6203"/>
+        <w:gridCol w:w="3515"/>
+      </w:tblGrid>
+      <w:tr>
+        <w:tc>
+          <w:tcPr>
+            <w:tcW w:w="6203" w:type="dxa"/>
+          </w:tcPr>
+          <w:p>
+            <w:pPr>
+              <w:pStyle w:val="BodyText"/>
+              <w:tabs>
+                <w:tab w:val="left" w:pos="1135"/>
+                <w:tab w:val="right" w:pos="9608"/>
+              </w:tabs>
+              <w:spacing w:line="300" w:lineRule="atLeast"/>
+              <w:ind w:right="36"/>
+              <w:rPr>
+                <w:spacing w:val="-16"/>
+              </w:rPr>
+            </w:pPr>
+            <w:r>
+              <w:rPr>
+                <w:spacing w:val="-2"/>
+              </w:rPr>
+              <w:t>Nomor</w:t>
+            </w:r>
+            <w:r>
+              <w:tab/>
+              <w:t>: ${no_undnagan}</w:t>
+            </w:r>
+          </w:p>
+        </w:tc>
+        <w:tc>
+          <w:tcPr>
+            <w:tcW w:w="3515" w:type="dxa"/>
+          </w:tcPr>
+          <w:p>
+            <w:pPr>
+              <w:pStyle w:val="BodyText"/>
+              <w:tabs>
+                <w:tab w:val="left" w:pos="1135"/>
+                <w:tab w:val="right" w:pos="9608"/>
+              </w:tabs>
+              <w:spacing w:line="300" w:lineRule="atLeast"/>
+              <w:ind w:right="36"/>
+              <w:rPr>
+                <w:spacing w:val="-16"/>
+              </w:rPr>
+            </w:pPr>
+            <w:r>
+              <w:t>${tgl_undangan}</w:t>
+            </w:r>
+          </w:p>
+        </w:tc>
+      </w:tr>
+    </w:tbl>
     <w:p>
       <w:pPr>
         <w:pStyle w:val="BodyText"/>
@@ -12,31 +85,6 @@
         <w:spacing w:line="300" w:lineRule="atLeast"/>
         <w:ind w:left="142" w:right="36"/>
       </w:pPr>
-      <w:r>
-        <w:rPr>
-          <w:spacing w:val="-2"/>
-        </w:rPr>
-        <w:t>Nomor</w:t>
-      </w:r>
-      <w:r>
-        <w:tab/>
-        <w:t xml:space="preserve">: </w:t>
-      </w:r>
-      <w:r>
-        <w:t>${no_undnagan}</w:t>
-      </w:r>
-      <w:r>
-        <w:tab/>
-      </w:r>
-      <w:r>
-        <w:t>${tgl_undangan}</w:t>
-      </w:r>
-      <w:r>
-        <w:rPr>
-          <w:spacing w:val="-16"/>
-        </w:rPr>
-        <w:t xml:space="preserve"> </w:t>
-      </w:r>
       <w:r>
         <w:rPr>
           <w:spacing w:val="-2"/>
@@ -135,7 +183,10 @@
         <w:ind w:left="142"/>
       </w:pPr>
       <w:r>
-        <w:t>Sehubungan dengan telah disetujuinya Disertasi mahasiswa Program Doktor Teknik Geofisika FTTM-ITB,</w:t>
+        <w:t xml:space="preserve">Sehubungan dengan telah disetujuinya Disertasi mahasiswa Program Doktor </w:t>
+      </w:r>
+      <w:r>
+        <w:t>Teknik Geofisika FTTM-ITB,</w:t>
       </w:r>
       <w:r>
         <w:rPr>
@@ -1274,6 +1325,7 @@
         <w:rPr>
           <w:u w:val="single"/>
         </w:rPr>
+        <w:lastRenderedPageBreak/>
         <w:t>${nama_wda}</w:t>
       </w:r>
     </w:p>
@@ -1301,6 +1353,14 @@
     </w:p>
     <w:p>
       <w:pPr>
+        <w:pBdr>
+          <w:top w:val="single" w:sz="4" w:space="1" w:color="auto"/>
+          <w:left w:val="single" w:sz="4" w:space="1" w:color="auto"/>
+          <w:bottom w:val="single" w:sz="4" w:space="1" w:color="auto"/>
+          <w:right w:val="single" w:sz="4" w:space="1" w:color="auto"/>
+          <w:between w:val="single" w:sz="4" w:space="1" w:color="auto"/>
+          <w:bar w:val="single" w:sz="4" w:color="auto"/>
+        </w:pBdr>
         <w:rPr>
           <w:sz w:val="20"/>
         </w:rPr>
@@ -1317,7 +1377,7 @@
 </file>
 
 <file path=word/endnotes.xml><?xml version="1.0" encoding="utf-8"?>
-<w:endnotes xmlns:wpc="http://schemas.microsoft.com/office/word/2010/wordprocessingCanvas" xmlns:cx="http://schemas.microsoft.com/office/drawing/2014/chartex" xmlns:cx1="http://schemas.microsoft.com/office/drawing/2015/9/8/chartex" xmlns:cx2="http://schemas.microsoft.com/office/drawing/2015/10/21/chartex" xmlns:cx3="http://schemas.microsoft.com/office/drawing/2016/5/9/chartex" xmlns:cx4="http://schemas.microsoft.com/office/drawing/2016/5/10/chartex" xmlns:cx5="http://schemas.microsoft.com/office/drawing/2016/5/11/chartex" xmlns:cx6="http://schemas.microsoft.com/office/drawing/2016/5/12/chartex" xmlns:cx7="http://schemas.microsoft.com/office/drawing/2016/5/13/chartex" xmlns:cx8="http://schemas.microsoft.com/office/drawing/2016/5/14/chartex" xmlns:mc="http://schemas.openxmlformats.org/markup-compatibility/2006" xmlns:aink="http://schemas.microsoft.com/office/drawing/2016/ink" xmlns:am3d="http://schemas.microsoft.com/office/drawing/2017/model3d" xmlns:o="urn:schemas-microsoft-com:office:office" xmlns:oel="http://schemas.microsoft.com/office/2019/extlst" xmlns:r="http://schemas.openxmlformats.org/officeDocument/2006/relationships" xmlns:m="http://schemas.openxmlformats.org/officeDocument/2006/math" xmlns:v="urn:schemas-microsoft-com:vml" xmlns:wp14="http://schemas.microsoft.com/office/word/2010/wordprocessingDrawing" xmlns:wp="http://schemas.openxmlformats.org/drawingml/2006/wordprocessingDrawing" xmlns:w10="urn:schemas-microsoft-com:office:word" xmlns:w="http://schemas.openxmlformats.org/wordprocessingml/2006/main" xmlns:w14="http://schemas.microsoft.com/office/word/2010/wordml" xmlns:w15="http://schemas.microsoft.com/office/word/2012/wordml" xmlns:w16cex="http://schemas.microsoft.com/office/word/2018/wordml/cex" xmlns:w16cid="http://schemas.microsoft.com/office/word/2016/wordml/cid" xmlns:w16="http://schemas.microsoft.com/office/word/2018/wordml" xmlns:w16du="http://schemas.microsoft.com/office/word/2023/wordml/word16du" xmlns:w16sdtdh="http://schemas.microsoft.com/office/word/2020/wordml/sdtdatahash" xmlns:w16sdtfl="http://schemas.microsoft.com/office/word/2024/wordml/sdtformatlock" xmlns:w16se="http://schemas.microsoft.com/office/word/2015/wordml/symex" xmlns:wpg="http://schemas.microsoft.com/office/word/2010/wordprocessingGroup" xmlns:wpi="http://schemas.microsoft.com/office/word/2010/wordprocessingInk" xmlns:wne="http://schemas.microsoft.com/office/word/2006/wordml" xmlns:wps="http://schemas.microsoft.com/office/word/2010/wordprocessingShape" mc:Ignorable="w14 w15 w16se w16cid w16 w16cex w16sdtdh w16sdtfl w16du wp14">
+<w:endnotes xmlns:wpc="http://schemas.microsoft.com/office/word/2010/wordprocessingCanvas" xmlns:cx="http://schemas.microsoft.com/office/drawing/2014/chartex" xmlns:mc="http://schemas.openxmlformats.org/markup-compatibility/2006" xmlns:o="urn:schemas-microsoft-com:office:office" xmlns:r="http://schemas.openxmlformats.org/officeDocument/2006/relationships" xmlns:m="http://schemas.openxmlformats.org/officeDocument/2006/math" xmlns:v="urn:schemas-microsoft-com:vml" xmlns:wp14="http://schemas.microsoft.com/office/word/2010/wordprocessingDrawing" xmlns:wp="http://schemas.openxmlformats.org/drawingml/2006/wordprocessingDrawing" xmlns:w10="urn:schemas-microsoft-com:office:word" xmlns:w="http://schemas.openxmlformats.org/wordprocessingml/2006/main" xmlns:w14="http://schemas.microsoft.com/office/word/2010/wordml" xmlns:w15="http://schemas.microsoft.com/office/word/2012/wordml" xmlns:w16se="http://schemas.microsoft.com/office/word/2015/wordml/symex" xmlns:wpg="http://schemas.microsoft.com/office/word/2010/wordprocessingGroup" xmlns:wpi="http://schemas.microsoft.com/office/word/2010/wordprocessingInk" xmlns:wne="http://schemas.microsoft.com/office/word/2006/wordml" xmlns:wps="http://schemas.microsoft.com/office/word/2010/wordprocessingShape" mc:Ignorable="w14 w15 w16se wp14">
   <w:endnote w:type="separator" w:id="-1">
     <w:p>
       <w:r>
@@ -1336,7 +1396,7 @@
 </file>
 
 <file path=word/footer1.xml><?xml version="1.0" encoding="utf-8"?>
-<w:ftr xmlns:wpc="http://schemas.microsoft.com/office/word/2010/wordprocessingCanvas" xmlns:cx="http://schemas.microsoft.com/office/drawing/2014/chartex" xmlns:cx1="http://schemas.microsoft.com/office/drawing/2015/9/8/chartex" xmlns:cx2="http://schemas.microsoft.com/office/drawing/2015/10/21/chartex" xmlns:cx3="http://schemas.microsoft.com/office/drawing/2016/5/9/chartex" xmlns:cx4="http://schemas.microsoft.com/office/drawing/2016/5/10/chartex" xmlns:cx5="http://schemas.microsoft.com/office/drawing/2016/5/11/chartex" xmlns:cx6="http://schemas.microsoft.com/office/drawing/2016/5/12/chartex" xmlns:cx7="http://schemas.microsoft.com/office/drawing/2016/5/13/chartex" xmlns:cx8="http://schemas.microsoft.com/office/drawing/2016/5/14/chartex" xmlns:mc="http://schemas.openxmlformats.org/markup-compatibility/2006" xmlns:aink="http://schemas.microsoft.com/office/drawing/2016/ink" xmlns:am3d="http://schemas.microsoft.com/office/drawing/2017/model3d" xmlns:o="urn:schemas-microsoft-com:office:office" xmlns:oel="http://schemas.microsoft.com/office/2019/extlst" xmlns:r="http://schemas.openxmlformats.org/officeDocument/2006/relationships" xmlns:m="http://schemas.openxmlformats.org/officeDocument/2006/math" xmlns:v="urn:schemas-microsoft-com:vml" xmlns:wp14="http://schemas.microsoft.com/office/word/2010/wordprocessingDrawing" xmlns:wp="http://schemas.openxmlformats.org/drawingml/2006/wordprocessingDrawing" xmlns:w10="urn:schemas-microsoft-com:office:word" xmlns:w="http://schemas.openxmlformats.org/wordprocessingml/2006/main" xmlns:w14="http://schemas.microsoft.com/office/word/2010/wordml" xmlns:w15="http://schemas.microsoft.com/office/word/2012/wordml" xmlns:w16cex="http://schemas.microsoft.com/office/word/2018/wordml/cex" xmlns:w16cid="http://schemas.microsoft.com/office/word/2016/wordml/cid" xmlns:w16="http://schemas.microsoft.com/office/word/2018/wordml" xmlns:w16du="http://schemas.microsoft.com/office/word/2023/wordml/word16du" xmlns:w16sdtdh="http://schemas.microsoft.com/office/word/2020/wordml/sdtdatahash" xmlns:w16sdtfl="http://schemas.microsoft.com/office/word/2024/wordml/sdtformatlock" xmlns:w16se="http://schemas.microsoft.com/office/word/2015/wordml/symex" xmlns:wpg="http://schemas.microsoft.com/office/word/2010/wordprocessingGroup" xmlns:wpi="http://schemas.microsoft.com/office/word/2010/wordprocessingInk" xmlns:wne="http://schemas.microsoft.com/office/word/2006/wordml" xmlns:wps="http://schemas.microsoft.com/office/word/2010/wordprocessingShape" mc:Ignorable="w14 w15 w16se w16cid w16 w16cex w16sdtdh w16sdtfl w16du wp14">
+<w:ftr xmlns:wpc="http://schemas.microsoft.com/office/word/2010/wordprocessingCanvas" xmlns:cx="http://schemas.microsoft.com/office/drawing/2014/chartex" xmlns:mc="http://schemas.openxmlformats.org/markup-compatibility/2006" xmlns:o="urn:schemas-microsoft-com:office:office" xmlns:r="http://schemas.openxmlformats.org/officeDocument/2006/relationships" xmlns:m="http://schemas.openxmlformats.org/officeDocument/2006/math" xmlns:v="urn:schemas-microsoft-com:vml" xmlns:wp14="http://schemas.microsoft.com/office/word/2010/wordprocessingDrawing" xmlns:wp="http://schemas.openxmlformats.org/drawingml/2006/wordprocessingDrawing" xmlns:w10="urn:schemas-microsoft-com:office:word" xmlns:w="http://schemas.openxmlformats.org/wordprocessingml/2006/main" xmlns:w14="http://schemas.microsoft.com/office/word/2010/wordml" xmlns:w15="http://schemas.microsoft.com/office/word/2012/wordml" xmlns:w16se="http://schemas.microsoft.com/office/word/2015/wordml/symex" xmlns:wpg="http://schemas.microsoft.com/office/word/2010/wordprocessingGroup" xmlns:wpi="http://schemas.microsoft.com/office/word/2010/wordprocessingInk" xmlns:wne="http://schemas.microsoft.com/office/word/2006/wordml" xmlns:wps="http://schemas.microsoft.com/office/word/2010/wordprocessingShape" mc:Ignorable="w14 w15 w16se wp14">
   <w:p>
     <w:pPr>
       <w:pStyle w:val="Footer"/>
@@ -1347,7 +1407,7 @@
         <w:lang w:val="en-US"/>
       </w:rPr>
       <w:drawing>
-        <wp:anchor distT="0" distB="0" distL="114300" distR="114300" simplePos="0" relativeHeight="251663360" behindDoc="0" locked="0" layoutInCell="1" allowOverlap="1" wp14:anchorId="734C0716" wp14:editId="5AE56239">
+        <wp:anchor distT="0" distB="0" distL="114300" distR="114300" simplePos="0" relativeHeight="251660288" behindDoc="0" locked="0" layoutInCell="1" allowOverlap="1" wp14:anchorId="734C0716" wp14:editId="5AE56239">
           <wp:simplePos x="0" y="0"/>
           <wp:positionH relativeFrom="page">
             <wp:posOffset>90805</wp:posOffset>
@@ -1418,7 +1478,7 @@
       <mc:AlternateContent>
         <mc:Choice Requires="wps">
           <w:drawing>
-            <wp:anchor distT="0" distB="0" distL="114300" distR="114300" simplePos="0" relativeHeight="251661312" behindDoc="0" locked="0" layoutInCell="1" allowOverlap="1" wp14:anchorId="306C27E9" wp14:editId="4043D09D">
+            <wp:anchor distT="0" distB="0" distL="114300" distR="114300" simplePos="0" relativeHeight="251658240" behindDoc="0" locked="0" layoutInCell="1" allowOverlap="1" wp14:anchorId="306C27E9" wp14:editId="4043D09D">
               <wp:simplePos x="0" y="0"/>
               <wp:positionH relativeFrom="margin">
                 <wp:posOffset>0</wp:posOffset>
@@ -1486,7 +1546,7 @@
         </mc:Choice>
         <mc:Fallback>
           <w:pict>
-            <v:line w14:anchorId="26C483AD" id="Line 416" o:spid="_x0000_s1026" style="position:absolute;z-index:251661312;visibility:visible;mso-wrap-style:square;mso-width-percent:0;mso-height-percent:0;mso-wrap-distance-left:9pt;mso-wrap-distance-top:0;mso-wrap-distance-right:9pt;mso-wrap-distance-bottom:0;mso-position-horizontal:absolute;mso-position-horizontal-relative:margin;mso-position-vertical:absolute;mso-position-vertical-relative:text;mso-width-percent:0;mso-height-percent:0;mso-width-relative:page;mso-height-relative:page" from="0,0" to="496.05pt,0" o:gfxdata="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" strokecolor="#7f7f7f [1612]" strokeweight="1.5pt">
+            <v:line w14:anchorId="630AC1E7" id="Line 416" o:spid="_x0000_s1026" style="position:absolute;z-index:251658240;visibility:visible;mso-wrap-style:square;mso-width-percent:0;mso-height-percent:0;mso-wrap-distance-left:9pt;mso-wrap-distance-top:0;mso-wrap-distance-right:9pt;mso-wrap-distance-bottom:0;mso-position-horizontal:absolute;mso-position-horizontal-relative:margin;mso-position-vertical:absolute;mso-position-vertical-relative:text;mso-width-percent:0;mso-height-percent:0;mso-width-relative:page;mso-height-relative:page" from="0,0" to="496.05pt,0" o:gfxdata="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" strokecolor="#7f7f7f [1612]" strokeweight="1.5pt">
               <w10:wrap anchorx="margin"/>
             </v:line>
           </w:pict>
@@ -1498,7 +1558,7 @@
 </file>
 
 <file path=word/footnotes.xml><?xml version="1.0" encoding="utf-8"?>
-<w:footnotes xmlns:wpc="http://schemas.microsoft.com/office/word/2010/wordprocessingCanvas" xmlns:cx="http://schemas.microsoft.com/office/drawing/2014/chartex" xmlns:cx1="http://schemas.microsoft.com/office/drawing/2015/9/8/chartex" xmlns:cx2="http://schemas.microsoft.com/office/drawing/2015/10/21/chartex" xmlns:cx3="http://schemas.microsoft.com/office/drawing/2016/5/9/chartex" xmlns:cx4="http://schemas.microsoft.com/office/drawing/2016/5/10/chartex" xmlns:cx5="http://schemas.microsoft.com/office/drawing/2016/5/11/chartex" xmlns:cx6="http://schemas.microsoft.com/office/drawing/2016/5/12/chartex" xmlns:cx7="http://schemas.microsoft.com/office/drawing/2016/5/13/chartex" xmlns:cx8="http://schemas.microsoft.com/office/drawing/2016/5/14/chartex" xmlns:mc="http://schemas.openxmlformats.org/markup-compatibility/2006" xmlns:aink="http://schemas.microsoft.com/office/drawing/2016/ink" xmlns:am3d="http://schemas.microsoft.com/office/drawing/2017/model3d" xmlns:o="urn:schemas-microsoft-com:office:office" xmlns:oel="http://schemas.microsoft.com/office/2019/extlst" xmlns:r="http://schemas.openxmlformats.org/officeDocument/2006/relationships" xmlns:m="http://schemas.openxmlformats.org/officeDocument/2006/math" xmlns:v="urn:schemas-microsoft-com:vml" xmlns:wp14="http://schemas.microsoft.com/office/word/2010/wordprocessingDrawing" xmlns:wp="http://schemas.openxmlformats.org/drawingml/2006/wordprocessingDrawing" xmlns:w10="urn:schemas-microsoft-com:office:word" xmlns:w="http://schemas.openxmlformats.org/wordprocessingml/2006/main" xmlns:w14="http://schemas.microsoft.com/office/word/2010/wordml" xmlns:w15="http://schemas.microsoft.com/office/word/2012/wordml" xmlns:w16cex="http://schemas.microsoft.com/office/word/2018/wordml/cex" xmlns:w16cid="http://schemas.microsoft.com/office/word/2016/wordml/cid" xmlns:w16="http://schemas.microsoft.com/office/word/2018/wordml" xmlns:w16du="http://schemas.microsoft.com/office/word/2023/wordml/word16du" xmlns:w16sdtdh="http://schemas.microsoft.com/office/word/2020/wordml/sdtdatahash" xmlns:w16sdtfl="http://schemas.microsoft.com/office/word/2024/wordml/sdtformatlock" xmlns:w16se="http://schemas.microsoft.com/office/word/2015/wordml/symex" xmlns:wpg="http://schemas.microsoft.com/office/word/2010/wordprocessingGroup" xmlns:wpi="http://schemas.microsoft.com/office/word/2010/wordprocessingInk" xmlns:wne="http://schemas.microsoft.com/office/word/2006/wordml" xmlns:wps="http://schemas.microsoft.com/office/word/2010/wordprocessingShape" mc:Ignorable="w14 w15 w16se w16cid w16 w16cex w16sdtdh w16sdtfl w16du wp14">
+<w:footnotes xmlns:wpc="http://schemas.microsoft.com/office/word/2010/wordprocessingCanvas" xmlns:cx="http://schemas.microsoft.com/office/drawing/2014/chartex" xmlns:mc="http://schemas.openxmlformats.org/markup-compatibility/2006" xmlns:o="urn:schemas-microsoft-com:office:office" xmlns:r="http://schemas.openxmlformats.org/officeDocument/2006/relationships" xmlns:m="http://schemas.openxmlformats.org/officeDocument/2006/math" xmlns:v="urn:schemas-microsoft-com:vml" xmlns:wp14="http://schemas.microsoft.com/office/word/2010/wordprocessingDrawing" xmlns:wp="http://schemas.openxmlformats.org/drawingml/2006/wordprocessingDrawing" xmlns:w10="urn:schemas-microsoft-com:office:word" xmlns:w="http://schemas.openxmlformats.org/wordprocessingml/2006/main" xmlns:w14="http://schemas.microsoft.com/office/word/2010/wordml" xmlns:w15="http://schemas.microsoft.com/office/word/2012/wordml" xmlns:w16se="http://schemas.microsoft.com/office/word/2015/wordml/symex" xmlns:wpg="http://schemas.microsoft.com/office/word/2010/wordprocessingGroup" xmlns:wpi="http://schemas.microsoft.com/office/word/2010/wordprocessingInk" xmlns:wne="http://schemas.microsoft.com/office/word/2006/wordml" xmlns:wps="http://schemas.microsoft.com/office/word/2010/wordprocessingShape" mc:Ignorable="w14 w15 w16se wp14">
   <w:footnote w:type="separator" w:id="-1">
     <w:p>
       <w:r>
@@ -1517,7 +1577,7 @@
 </file>
 
 <file path=word/header1.xml><?xml version="1.0" encoding="utf-8"?>
-<w:hdr xmlns:wpc="http://schemas.microsoft.com/office/word/2010/wordprocessingCanvas" xmlns:cx="http://schemas.microsoft.com/office/drawing/2014/chartex" xmlns:cx1="http://schemas.microsoft.com/office/drawing/2015/9/8/chartex" xmlns:cx2="http://schemas.microsoft.com/office/drawing/2015/10/21/chartex" xmlns:cx3="http://schemas.microsoft.com/office/drawing/2016/5/9/chartex" xmlns:cx4="http://schemas.microsoft.com/office/drawing/2016/5/10/chartex" xmlns:cx5="http://schemas.microsoft.com/office/drawing/2016/5/11/chartex" xmlns:cx6="http://schemas.microsoft.com/office/drawing/2016/5/12/chartex" xmlns:cx7="http://schemas.microsoft.com/office/drawing/2016/5/13/chartex" xmlns:cx8="http://schemas.microsoft.com/office/drawing/2016/5/14/chartex" xmlns:mc="http://schemas.openxmlformats.org/markup-compatibility/2006" xmlns:aink="http://schemas.microsoft.com/office/drawing/2016/ink" xmlns:am3d="http://schemas.microsoft.com/office/drawing/2017/model3d" xmlns:o="urn:schemas-microsoft-com:office:office" xmlns:oel="http://schemas.microsoft.com/office/2019/extlst" xmlns:r="http://schemas.openxmlformats.org/officeDocument/2006/relationships" xmlns:m="http://schemas.openxmlformats.org/officeDocument/2006/math" xmlns:v="urn:schemas-microsoft-com:vml" xmlns:wp14="http://schemas.microsoft.com/office/word/2010/wordprocessingDrawing" xmlns:wp="http://schemas.openxmlformats.org/drawingml/2006/wordprocessingDrawing" xmlns:w10="urn:schemas-microsoft-com:office:word" xmlns:w="http://schemas.openxmlformats.org/wordprocessingml/2006/main" xmlns:w14="http://schemas.microsoft.com/office/word/2010/wordml" xmlns:w15="http://schemas.microsoft.com/office/word/2012/wordml" xmlns:w16cex="http://schemas.microsoft.com/office/word/2018/wordml/cex" xmlns:w16cid="http://schemas.microsoft.com/office/word/2016/wordml/cid" xmlns:w16="http://schemas.microsoft.com/office/word/2018/wordml" xmlns:w16du="http://schemas.microsoft.com/office/word/2023/wordml/word16du" xmlns:w16sdtdh="http://schemas.microsoft.com/office/word/2020/wordml/sdtdatahash" xmlns:w16sdtfl="http://schemas.microsoft.com/office/word/2024/wordml/sdtformatlock" xmlns:w16se="http://schemas.microsoft.com/office/word/2015/wordml/symex" xmlns:wpg="http://schemas.microsoft.com/office/word/2010/wordprocessingGroup" xmlns:wpi="http://schemas.microsoft.com/office/word/2010/wordprocessingInk" xmlns:wne="http://schemas.microsoft.com/office/word/2006/wordml" xmlns:wps="http://schemas.microsoft.com/office/word/2010/wordprocessingShape" mc:Ignorable="w14 w15 w16se w16cid w16 w16cex w16sdtdh w16sdtfl w16du wp14">
+<w:hdr xmlns:wpc="http://schemas.microsoft.com/office/word/2010/wordprocessingCanvas" xmlns:cx="http://schemas.microsoft.com/office/drawing/2014/chartex" xmlns:mc="http://schemas.openxmlformats.org/markup-compatibility/2006" xmlns:o="urn:schemas-microsoft-com:office:office" xmlns:r="http://schemas.openxmlformats.org/officeDocument/2006/relationships" xmlns:m="http://schemas.openxmlformats.org/officeDocument/2006/math" xmlns:v="urn:schemas-microsoft-com:vml" xmlns:wp14="http://schemas.microsoft.com/office/word/2010/wordprocessingDrawing" xmlns:wp="http://schemas.openxmlformats.org/drawingml/2006/wordprocessingDrawing" xmlns:w10="urn:schemas-microsoft-com:office:word" xmlns:w="http://schemas.openxmlformats.org/wordprocessingml/2006/main" xmlns:w14="http://schemas.microsoft.com/office/word/2010/wordml" xmlns:w15="http://schemas.microsoft.com/office/word/2012/wordml" xmlns:w16se="http://schemas.microsoft.com/office/word/2015/wordml/symex" xmlns:wpg="http://schemas.microsoft.com/office/word/2010/wordprocessingGroup" xmlns:wpi="http://schemas.microsoft.com/office/word/2010/wordprocessingInk" xmlns:wne="http://schemas.microsoft.com/office/word/2006/wordml" xmlns:wps="http://schemas.microsoft.com/office/word/2010/wordprocessingShape" mc:Ignorable="w14 w15 w16se wp14">
   <w:tbl>
     <w:tblPr>
       <w:tblW w:w="9957" w:type="dxa"/>
@@ -1546,6 +1606,7 @@
           <w:r>
             <w:rPr>
               <w:noProof/>
+              <w:lang w:val="en-US"/>
             </w:rPr>
             <w:drawing>
               <wp:inline distT="0" distB="0" distL="0" distR="0" wp14:anchorId="4B94FF86" wp14:editId="2E1B8F0C">
@@ -1748,7 +1809,7 @@
       <mc:AlternateContent>
         <mc:Choice Requires="wps">
           <w:drawing>
-            <wp:anchor distT="0" distB="0" distL="114300" distR="114300" simplePos="0" relativeHeight="251659264" behindDoc="0" locked="0" layoutInCell="1" allowOverlap="1" wp14:anchorId="309F7A57" wp14:editId="71251EAA">
+            <wp:anchor distT="0" distB="0" distL="114300" distR="114300" simplePos="0" relativeHeight="251656192" behindDoc="0" locked="0" layoutInCell="1" allowOverlap="1" wp14:anchorId="309F7A57" wp14:editId="71251EAA">
               <wp:simplePos x="0" y="0"/>
               <wp:positionH relativeFrom="margin">
                 <wp:posOffset>0</wp:posOffset>
@@ -1809,7 +1870,7 @@
         </mc:Choice>
         <mc:Fallback>
           <w:pict>
-            <v:line w14:anchorId="03B585FB" id="Line 416" o:spid="_x0000_s1026" style="position:absolute;z-index:251659264;visibility:visible;mso-wrap-style:square;mso-width-percent:0;mso-height-percent:0;mso-wrap-distance-left:9pt;mso-wrap-distance-top:0;mso-wrap-distance-right:9pt;mso-wrap-distance-bottom:0;mso-position-horizontal:absolute;mso-position-horizontal-relative:margin;mso-position-vertical:absolute;mso-position-vertical-relative:text;mso-width-percent:0;mso-height-percent:0;mso-width-relative:page;mso-height-relative:page" from="0,1.45pt" to="496.05pt,1.45pt" o:gfxdata="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" strokeweight="3.75pt">
+            <v:line w14:anchorId="3FDF6EBC" id="Line 416" o:spid="_x0000_s1026" style="position:absolute;z-index:251656192;visibility:visible;mso-wrap-style:square;mso-width-percent:0;mso-height-percent:0;mso-wrap-distance-left:9pt;mso-wrap-distance-top:0;mso-wrap-distance-right:9pt;mso-wrap-distance-bottom:0;mso-position-horizontal:absolute;mso-position-horizontal-relative:margin;mso-position-vertical:absolute;mso-position-vertical-relative:text;mso-width-percent:0;mso-height-percent:0;mso-width-relative:page;mso-height-relative:page" from="0,1.45pt" to="496.05pt,1.45pt" o:gfxdata="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" strokeweight="3.75pt">
               <v:stroke linestyle="thinThick"/>
               <w10:wrap anchorx="margin"/>
             </v:line>
@@ -1822,7 +1883,7 @@
 </file>
 
 <file path=word/numbering.xml><?xml version="1.0" encoding="utf-8"?>
-<w:numbering xmlns:wpc="http://schemas.microsoft.com/office/word/2010/wordprocessingCanvas" xmlns:cx="http://schemas.microsoft.com/office/drawing/2014/chartex" xmlns:cx1="http://schemas.microsoft.com/office/drawing/2015/9/8/chartex" xmlns:cx2="http://schemas.microsoft.com/office/drawing/2015/10/21/chartex" xmlns:cx3="http://schemas.microsoft.com/office/drawing/2016/5/9/chartex" xmlns:cx4="http://schemas.microsoft.com/office/drawing/2016/5/10/chartex" xmlns:cx5="http://schemas.microsoft.com/office/drawing/2016/5/11/chartex" xmlns:cx6="http://schemas.microsoft.com/office/drawing/2016/5/12/chartex" xmlns:cx7="http://schemas.microsoft.com/office/drawing/2016/5/13/chartex" xmlns:cx8="http://schemas.microsoft.com/office/drawing/2016/5/14/chartex" xmlns:mc="http://schemas.openxmlformats.org/markup-compatibility/2006" xmlns:aink="http://schemas.microsoft.com/office/drawing/2016/ink" xmlns:am3d="http://schemas.microsoft.com/office/drawing/2017/model3d" xmlns:o="urn:schemas-microsoft-com:office:office" xmlns:oel="http://schemas.microsoft.com/office/2019/extlst" xmlns:r="http://schemas.openxmlformats.org/officeDocument/2006/relationships" xmlns:m="http://schemas.openxmlformats.org/officeDocument/2006/math" xmlns:v="urn:schemas-microsoft-com:vml" xmlns:wp14="http://schemas.microsoft.com/office/word/2010/wordprocessingDrawing" xmlns:wp="http://schemas.openxmlformats.org/drawingml/2006/wordprocessingDrawing" xmlns:w10="urn:schemas-microsoft-com:office:word" xmlns:w="http://schemas.openxmlformats.org/wordprocessingml/2006/main" xmlns:w14="http://schemas.microsoft.com/office/word/2010/wordml" xmlns:w15="http://schemas.microsoft.com/office/word/2012/wordml" xmlns:w16cex="http://schemas.microsoft.com/office/word/2018/wordml/cex" xmlns:w16cid="http://schemas.microsoft.com/office/word/2016/wordml/cid" xmlns:w16="http://schemas.microsoft.com/office/word/2018/wordml" xmlns:w16du="http://schemas.microsoft.com/office/word/2023/wordml/word16du" xmlns:w16sdtdh="http://schemas.microsoft.com/office/word/2020/wordml/sdtdatahash" xmlns:w16sdtfl="http://schemas.microsoft.com/office/word/2024/wordml/sdtformatlock" xmlns:w16se="http://schemas.microsoft.com/office/word/2015/wordml/symex" xmlns:wpg="http://schemas.microsoft.com/office/word/2010/wordprocessingGroup" xmlns:wpi="http://schemas.microsoft.com/office/word/2010/wordprocessingInk" xmlns:wne="http://schemas.microsoft.com/office/word/2006/wordml" xmlns:wps="http://schemas.microsoft.com/office/word/2010/wordprocessingShape" mc:Ignorable="w14 w15 w16se w16cid w16 w16cex w16sdtdh w16sdtfl w16du wp14">
+<w:numbering xmlns:wpc="http://schemas.microsoft.com/office/word/2010/wordprocessingCanvas" xmlns:cx="http://schemas.microsoft.com/office/drawing/2014/chartex" xmlns:mc="http://schemas.openxmlformats.org/markup-compatibility/2006" xmlns:o="urn:schemas-microsoft-com:office:office" xmlns:r="http://schemas.openxmlformats.org/officeDocument/2006/relationships" xmlns:m="http://schemas.openxmlformats.org/officeDocument/2006/math" xmlns:v="urn:schemas-microsoft-com:vml" xmlns:wp14="http://schemas.microsoft.com/office/word/2010/wordprocessingDrawing" xmlns:wp="http://schemas.openxmlformats.org/drawingml/2006/wordprocessingDrawing" xmlns:w10="urn:schemas-microsoft-com:office:word" xmlns:w="http://schemas.openxmlformats.org/wordprocessingml/2006/main" xmlns:w14="http://schemas.microsoft.com/office/word/2010/wordml" xmlns:w15="http://schemas.microsoft.com/office/word/2012/wordml" xmlns:w16se="http://schemas.microsoft.com/office/word/2015/wordml/symex" xmlns:wpg="http://schemas.microsoft.com/office/word/2010/wordprocessingGroup" xmlns:wpi="http://schemas.microsoft.com/office/word/2010/wordprocessingInk" xmlns:wne="http://schemas.microsoft.com/office/word/2006/wordml" xmlns:wps="http://schemas.microsoft.com/office/word/2010/wordprocessingShape" mc:Ignorable="w14 w15 w16se wp14">
   <w:abstractNum w:abstractNumId="0" w15:restartNumberingAfterBreak="0">
     <w:nsid w:val="03B60AD1"/>
     <w:multiLevelType w:val="hybridMultilevel"/>
@@ -2069,17 +2130,17 @@
       </w:rPr>
     </w:lvl>
   </w:abstractNum>
-  <w:num w:numId="1" w16cid:durableId="1474837131">
+  <w:num w:numId="1">
     <w:abstractNumId w:val="1"/>
   </w:num>
-  <w:num w:numId="2" w16cid:durableId="1681004991">
+  <w:num w:numId="2">
     <w:abstractNumId w:val="0"/>
   </w:num>
 </w:numbering>
 </file>
 
 <file path=word/styles.xml><?xml version="1.0" encoding="utf-8"?>
-<w:styles xmlns:mc="http://schemas.openxmlformats.org/markup-compatibility/2006" xmlns:r="http://schemas.openxmlformats.org/officeDocument/2006/relationships" xmlns:w="http://schemas.openxmlformats.org/wordprocessingml/2006/main" xmlns:w14="http://schemas.microsoft.com/office/word/2010/wordml" xmlns:w15="http://schemas.microsoft.com/office/word/2012/wordml" xmlns:w16cex="http://schemas.microsoft.com/office/word/2018/wordml/cex" xmlns:w16cid="http://schemas.microsoft.com/office/word/2016/wordml/cid" xmlns:w16="http://schemas.microsoft.com/office/word/2018/wordml" xmlns:w16du="http://schemas.microsoft.com/office/word/2023/wordml/word16du" xmlns:w16sdtdh="http://schemas.microsoft.com/office/word/2020/wordml/sdtdatahash" xmlns:w16sdtfl="http://schemas.microsoft.com/office/word/2024/wordml/sdtformatlock" xmlns:w16se="http://schemas.microsoft.com/office/word/2015/wordml/symex" mc:Ignorable="w14 w15 w16se w16cid w16 w16cex w16sdtdh w16sdtfl w16du">
+<w:styles xmlns:mc="http://schemas.openxmlformats.org/markup-compatibility/2006" xmlns:r="http://schemas.openxmlformats.org/officeDocument/2006/relationships" xmlns:w="http://schemas.openxmlformats.org/wordprocessingml/2006/main" xmlns:w14="http://schemas.microsoft.com/office/word/2010/wordml" xmlns:w15="http://schemas.microsoft.com/office/word/2012/wordml" xmlns:w16se="http://schemas.microsoft.com/office/word/2015/wordml/symex" mc:Ignorable="w14 w15 w16se">
   <w:docDefaults>
     <w:rPrDefault>
       <w:rPr>
@@ -2097,7 +2158,7 @@
       </w:pPr>
     </w:pPrDefault>
   </w:docDefaults>
-  <w:latentStyles w:defLockedState="0" w:defUIPriority="99" w:defSemiHidden="0" w:defUnhideWhenUsed="0" w:defQFormat="0" w:count="376">
+  <w:latentStyles w:defLockedState="0" w:defUIPriority="99" w:defSemiHidden="0" w:defUnhideWhenUsed="0" w:defQFormat="0" w:count="371">
     <w:lsdException w:name="Normal" w:uiPriority="0" w:qFormat="1"/>
     <w:lsdException w:name="heading 1" w:uiPriority="9" w:qFormat="1"/>
     <w:lsdException w:name="heading 2" w:semiHidden="1" w:uiPriority="9" w:unhideWhenUsed="1" w:qFormat="1"/>
@@ -2469,11 +2530,6 @@
     <w:lsdException w:name="List Table 5 Dark Accent 6" w:uiPriority="50"/>
     <w:lsdException w:name="List Table 6 Colorful Accent 6" w:uiPriority="51"/>
     <w:lsdException w:name="List Table 7 Colorful Accent 6" w:uiPriority="52"/>
-    <w:lsdException w:name="Mention" w:semiHidden="1" w:unhideWhenUsed="1"/>
-    <w:lsdException w:name="Smart Hyperlink" w:semiHidden="1" w:unhideWhenUsed="1"/>
-    <w:lsdException w:name="Hashtag" w:semiHidden="1" w:unhideWhenUsed="1"/>
-    <w:lsdException w:name="Unresolved Mention" w:semiHidden="1" w:unhideWhenUsed="1"/>
-    <w:lsdException w:name="Smart Link" w:semiHidden="1" w:unhideWhenUsed="1"/>
   </w:latentStyles>
   <w:style w:type="paragraph" w:default="1" w:styleId="Normal">
     <w:name w:val="Normal"/>
@@ -2600,6 +2656,22 @@
       <w:rFonts w:ascii="Tahoma" w:eastAsia="Tahoma" w:hAnsi="Tahoma" w:cs="Tahoma"/>
       <w:lang w:val="id"/>
     </w:rPr>
+  </w:style>
+  <w:style w:type="table" w:styleId="TableGrid">
+    <w:name w:val="Table Grid"/>
+    <w:basedOn w:val="TableNormal"/>
+    <w:uiPriority w:val="39"/>
+    <w:rsid w:val="0040095C"/>
+    <w:tblPr>
+      <w:tblBorders>
+        <w:top w:val="single" w:sz="4" w:space="0" w:color="auto"/>
+        <w:left w:val="single" w:sz="4" w:space="0" w:color="auto"/>
+        <w:bottom w:val="single" w:sz="4" w:space="0" w:color="auto"/>
+        <w:right w:val="single" w:sz="4" w:space="0" w:color="auto"/>
+        <w:insideH w:val="single" w:sz="4" w:space="0" w:color="auto"/>
+        <w:insideV w:val="single" w:sz="4" w:space="0" w:color="auto"/>
+      </w:tblBorders>
+    </w:tblPr>
   </w:style>
 </w:styles>
 </file>
@@ -2892,7 +2964,7 @@
 </file>
 
 <file path=customXml/itemProps1.xml><?xml version="1.0" encoding="utf-8"?>
-<ds:datastoreItem xmlns:ds="http://schemas.openxmlformats.org/officeDocument/2006/customXml" ds:itemID="{D9D7AD84-7F9F-4815-A952-CF0E86803800}">
+<ds:datastoreItem xmlns:ds="http://schemas.openxmlformats.org/officeDocument/2006/customXml" ds:itemID="{D4AA9421-4A73-4585-9DBC-7AFEBF1B1436}">
   <ds:schemaRefs>
     <ds:schemaRef ds:uri="http://schemas.openxmlformats.org/officeDocument/2006/bibliography"/>
   </ds:schemaRefs>

</xml_diff>

<commit_message>
refactor(template): update seminar invitation templates to improve formatting and placeholder consistency
</commit_message>
<xml_diff>
--- a/template/undangan seminar kemajuan TEMPLATE.docx
+++ b/template/undangan seminar kemajuan TEMPLATE.docx
@@ -1353,18 +1353,12 @@
     </w:p>
     <w:p>
       <w:pPr>
-        <w:pBdr>
-          <w:top w:val="single" w:sz="4" w:space="1" w:color="auto"/>
-          <w:left w:val="single" w:sz="4" w:space="1" w:color="auto"/>
-          <w:bottom w:val="single" w:sz="4" w:space="1" w:color="auto"/>
-          <w:right w:val="single" w:sz="4" w:space="1" w:color="auto"/>
-          <w:between w:val="single" w:sz="4" w:space="1" w:color="auto"/>
-          <w:bar w:val="single" w:sz="4" w:color="auto"/>
-        </w:pBdr>
-        <w:rPr>
-          <w:sz w:val="20"/>
-        </w:rPr>
-      </w:pPr>
+        <w:rPr>
+          <w:sz w:val="20"/>
+        </w:rPr>
+      </w:pPr>
+      <w:bookmarkStart w:id="0" w:name="_GoBack"/>
+      <w:bookmarkEnd w:id="0"/>
     </w:p>
     <w:sectPr>
       <w:type w:val="continuous"/>
@@ -1407,7 +1401,7 @@
         <w:lang w:val="en-US"/>
       </w:rPr>
       <w:drawing>
-        <wp:anchor distT="0" distB="0" distL="114300" distR="114300" simplePos="0" relativeHeight="251660288" behindDoc="0" locked="0" layoutInCell="1" allowOverlap="1" wp14:anchorId="734C0716" wp14:editId="5AE56239">
+        <wp:anchor distT="0" distB="0" distL="114300" distR="114300" simplePos="0" relativeHeight="251659264" behindDoc="0" locked="0" layoutInCell="1" allowOverlap="1" wp14:anchorId="734C0716" wp14:editId="5AE56239">
           <wp:simplePos x="0" y="0"/>
           <wp:positionH relativeFrom="page">
             <wp:posOffset>90805</wp:posOffset>
@@ -1478,7 +1472,7 @@
       <mc:AlternateContent>
         <mc:Choice Requires="wps">
           <w:drawing>
-            <wp:anchor distT="0" distB="0" distL="114300" distR="114300" simplePos="0" relativeHeight="251658240" behindDoc="0" locked="0" layoutInCell="1" allowOverlap="1" wp14:anchorId="306C27E9" wp14:editId="4043D09D">
+            <wp:anchor distT="0" distB="0" distL="114300" distR="114300" simplePos="0" relativeHeight="251657216" behindDoc="0" locked="0" layoutInCell="1" allowOverlap="1" wp14:anchorId="306C27E9" wp14:editId="4043D09D">
               <wp:simplePos x="0" y="0"/>
               <wp:positionH relativeFrom="margin">
                 <wp:posOffset>0</wp:posOffset>
@@ -1546,7 +1540,7 @@
         </mc:Choice>
         <mc:Fallback>
           <w:pict>
-            <v:line w14:anchorId="630AC1E7" id="Line 416" o:spid="_x0000_s1026" style="position:absolute;z-index:251658240;visibility:visible;mso-wrap-style:square;mso-width-percent:0;mso-height-percent:0;mso-wrap-distance-left:9pt;mso-wrap-distance-top:0;mso-wrap-distance-right:9pt;mso-wrap-distance-bottom:0;mso-position-horizontal:absolute;mso-position-horizontal-relative:margin;mso-position-vertical:absolute;mso-position-vertical-relative:text;mso-width-percent:0;mso-height-percent:0;mso-width-relative:page;mso-height-relative:page" from="0,0" to="496.05pt,0" o:gfxdata="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" strokecolor="#7f7f7f [1612]" strokeweight="1.5pt">
+            <v:line w14:anchorId="2F9C8216" id="Line 416" o:spid="_x0000_s1026" style="position:absolute;z-index:251657216;visibility:visible;mso-wrap-style:square;mso-width-percent:0;mso-height-percent:0;mso-wrap-distance-left:9pt;mso-wrap-distance-top:0;mso-wrap-distance-right:9pt;mso-wrap-distance-bottom:0;mso-position-horizontal:absolute;mso-position-horizontal-relative:margin;mso-position-vertical:absolute;mso-position-vertical-relative:text;mso-width-percent:0;mso-height-percent:0;mso-width-relative:page;mso-height-relative:page" from="0,0" to="496.05pt,0" o:gfxdata="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" strokecolor="#7f7f7f [1612]" strokeweight="1.5pt">
               <w10:wrap anchorx="margin"/>
             </v:line>
           </w:pict>
@@ -1809,7 +1803,7 @@
       <mc:AlternateContent>
         <mc:Choice Requires="wps">
           <w:drawing>
-            <wp:anchor distT="0" distB="0" distL="114300" distR="114300" simplePos="0" relativeHeight="251656192" behindDoc="0" locked="0" layoutInCell="1" allowOverlap="1" wp14:anchorId="309F7A57" wp14:editId="71251EAA">
+            <wp:anchor distT="0" distB="0" distL="114300" distR="114300" simplePos="0" relativeHeight="251655168" behindDoc="0" locked="0" layoutInCell="1" allowOverlap="1" wp14:anchorId="309F7A57" wp14:editId="71251EAA">
               <wp:simplePos x="0" y="0"/>
               <wp:positionH relativeFrom="margin">
                 <wp:posOffset>0</wp:posOffset>
@@ -1870,7 +1864,7 @@
         </mc:Choice>
         <mc:Fallback>
           <w:pict>
-            <v:line w14:anchorId="3FDF6EBC" id="Line 416" o:spid="_x0000_s1026" style="position:absolute;z-index:251656192;visibility:visible;mso-wrap-style:square;mso-width-percent:0;mso-height-percent:0;mso-wrap-distance-left:9pt;mso-wrap-distance-top:0;mso-wrap-distance-right:9pt;mso-wrap-distance-bottom:0;mso-position-horizontal:absolute;mso-position-horizontal-relative:margin;mso-position-vertical:absolute;mso-position-vertical-relative:text;mso-width-percent:0;mso-height-percent:0;mso-width-relative:page;mso-height-relative:page" from="0,1.45pt" to="496.05pt,1.45pt" o:gfxdata="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" strokeweight="3.75pt">
+            <v:line w14:anchorId="0F03D3E5" id="Line 416" o:spid="_x0000_s1026" style="position:absolute;z-index:251655168;visibility:visible;mso-wrap-style:square;mso-width-percent:0;mso-height-percent:0;mso-wrap-distance-left:9pt;mso-wrap-distance-top:0;mso-wrap-distance-right:9pt;mso-wrap-distance-bottom:0;mso-position-horizontal:absolute;mso-position-horizontal-relative:margin;mso-position-vertical:absolute;mso-position-vertical-relative:text;mso-width-percent:0;mso-height-percent:0;mso-width-relative:page;mso-height-relative:page" from="0,1.45pt" to="496.05pt,1.45pt" o:gfxdata="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" strokeweight="3.75pt">
               <v:stroke linestyle="thinThick"/>
               <w10:wrap anchorx="margin"/>
             </v:line>
@@ -2964,7 +2958,7 @@
 </file>
 
 <file path=customXml/itemProps1.xml><?xml version="1.0" encoding="utf-8"?>
-<ds:datastoreItem xmlns:ds="http://schemas.openxmlformats.org/officeDocument/2006/customXml" ds:itemID="{D4AA9421-4A73-4585-9DBC-7AFEBF1B1436}">
+<ds:datastoreItem xmlns:ds="http://schemas.openxmlformats.org/officeDocument/2006/customXml" ds:itemID="{3DE9E714-AA58-4293-827B-869BFFE2F38C}">
   <ds:schemaRefs>
     <ds:schemaRef ds:uri="http://schemas.openxmlformats.org/officeDocument/2006/bibliography"/>
   </ds:schemaRefs>

</xml_diff>